<commit_message>
Place #35 DOCX labels at either code edge
</commit_message>
<xml_diff>
--- a/media/export-reference.docx
+++ b/media/export-reference.docx
@@ -1193,6 +1193,36 @@
       <w:sz w:val="18"/>
       <w:szCs w:val="18"/>
     </w:rPr>
+  </w:style>
+  <w:style w:type="paragraph" w:customStyle="1" w:styleId="CodeLanguageTopLeft">
+    <w:name w:val="Code Language Top Left"/>
+    <w:basedOn w:val="CodeLanguage"/>
+    <w:pPr>
+      <w:keepNext w:val="1"/>
+      <w:spacing w:before="140" w:after="0" w:line="240" w:lineRule="auto"/>
+      <w:ind w:left="60" w:right="60"/>
+      <w:jc w:val="left"/>
+    </w:pPr>
+  </w:style>
+  <w:style w:type="paragraph" w:customStyle="1" w:styleId="CodeLanguageTopRight">
+    <w:name w:val="Code Language Top Right"/>
+    <w:basedOn w:val="CodeLanguage"/>
+    <w:pPr>
+      <w:keepNext w:val="1"/>
+      <w:spacing w:before="140" w:after="0" w:line="240" w:lineRule="auto"/>
+      <w:ind w:left="60" w:right="60"/>
+      <w:jc w:val="right"/>
+    </w:pPr>
+  </w:style>
+  <w:style w:type="paragraph" w:customStyle="1" w:styleId="CodeLanguageBottomLeft">
+    <w:name w:val="Code Language Bottom Left"/>
+    <w:basedOn w:val="CodeLanguage"/>
+    <w:pPr>
+      <w:keepNext w:val="0"/>
+      <w:spacing w:before="0" w:after="180" w:line="240" w:lineRule="auto"/>
+      <w:ind w:left="60" w:right="60"/>
+      <w:jc w:val="left"/>
+    </w:pPr>
   </w:style>
 </w:styles>
 </file>

</xml_diff>